<commit_message>
Refine question association rules
</commit_message>
<xml_diff>
--- a/docs/NPS问题关联功能PRD-V1.1.docx
+++ b/docs/NPS问题关联功能PRD-V1.1.docx
@@ -2669,7 +2669,7 @@
                 <w:b w:val="0"/>
                 <w:sz w:val="18"/>
               </w:rPr>
-              <w:t>下拉复选框；选项由当前问题类型生成：评分题为分值，单选/多选题为选项值，其他题为“有填写/未填写”。</w:t>
+              <w:t>下拉复选框；评分题为分值，单选/多选题为选项值，开放题仅提供“有填写开放题”一个选项，其他题为“有填写/未填写”。</w:t>
             </w:r>
           </w:p>
         </w:tc>
@@ -3227,7 +3227,7 @@
                 <w:b w:val="0"/>
                 <w:sz w:val="18"/>
               </w:rPr>
-              <w:t>不同条件的问题答案不允许删除。</w:t>
+              <w:t>不同条件的问题答案不允许重复。</w:t>
             </w:r>
           </w:p>
         </w:tc>
@@ -3829,7 +3829,7 @@
                 <w:b w:val="0"/>
                 <w:sz w:val="18"/>
               </w:rPr>
-              <w:t>不同条件的问题答案不允许删除。</w:t>
+              <w:t>不同条件的问题答案不允许重复。</w:t>
             </w:r>
           </w:p>
         </w:tc>
@@ -5437,7 +5437,7 @@
                 <w:b w:val="0"/>
                 <w:sz w:val="18"/>
               </w:rPr>
-              <w:t>不同条件的问题答案不允许删除。</w:t>
+              <w:t>不同条件的问题答案不允许重复。</w:t>
             </w:r>
           </w:p>
         </w:tc>

</xml_diff>